<commit_message>
sessions 13-17: 4 paper drafts, 7 analysis scripts, 11 figures, critical reviews
Secures previously-uncommitted work (last commit was session 12): Papers 3/4/5 drafts (md/docx/pdf), Paper 2 revisions, title page; scripts 12-18 (robustness, anchoring, paper3 extended, darkness pilot, prosecutorial, corruption anatomy, paper4 robustness); 11 publication figures, critical review s13, cross-national benchmark, new research angles, publication strategy.

Context: Paper 2 (CRIS-D-26-00272) DESK-REJECTED by CLSC 2026-05-22 on novelty grounds. Strategic review underway.

Co-Authored-By: Claude Opus 4.7 (1M context) <noreply@anthropic.com>
</commit_message>
<xml_diff>
--- a/reports/paper2_cover_letter.docx
+++ b/reports/paper2_cover_letter.docx
@@ -156,7 +156,7 @@
         <w:pStyle w:val="BodyText"/>
       </w:pPr>
       <w:r>
-        <w:t xml:space="preserve">The manuscript has not been submitted elsewhere and all authors approve this submission. Code and data are available for reproducibility.</w:t>
+        <w:t xml:space="preserve">The manuscript has not been submitted elsewhere. Code and data are available for reproducibility. A preprint version has been posted on SSRN (Abstract ID: 6574140).</w:t>
       </w:r>
     </w:p>
     <w:p>
@@ -164,6 +164,14 @@
         <w:pStyle w:val="BodyText"/>
       </w:pPr>
       <w:r>
+        <w:t xml:space="preserve">In accordance with Springer Nature’s policy on AI-assisted tools, I disclose that Claude (Anthropic) was used as a computational research assistant for programming, literature search, and manuscript drafting. All analyses were independently verified through reproducible scripts, and I take full responsibility for all scientific claims and interpretations. Full details are provided in the Declarations section of the manuscript.</w:t>
+      </w:r>
+    </w:p>
+    <w:p>
+      <w:pPr>
+        <w:pStyle w:val="BodyText"/>
+      </w:pPr>
+      <w:r>
         <w:t xml:space="preserve">Sincerely,</w:t>
       </w:r>
       <w:r>
@@ -176,7 +184,19 @@
         <w:t xml:space="preserve"> </w:t>
       </w:r>
       <w:r>
-        <w:t xml:space="preserve">Universitas [X], Malang, Indonesia</w:t>
+        <w:t xml:space="preserve">Department of Informatics, Universitas Bhinneka Nusantara, Malang, Indonesia</w:t>
+      </w:r>
+      <w:r>
+        <w:t xml:space="preserve"> </w:t>
+      </w:r>
+      <w:r>
+        <w:t xml:space="preserve">Email: amien@ubhinus.ac.id</w:t>
+      </w:r>
+      <w:r>
+        <w:t xml:space="preserve"> </w:t>
+      </w:r>
+      <w:r>
+        <w:t xml:space="preserve">ORCID: 0000-0002-1848-167X</w:t>
       </w:r>
     </w:p>
     <w:bookmarkEnd w:id="9"/>

</xml_diff>

<commit_message>
P2 refreshed to ronde-9 corpus + retarget AI & Law (free/Scopus/Q1)
- Re-run scripts/11 + 12 on ronde-9 DB (n 367->374)
- Findings survived & strengthened: Pasal 2 b=0.818 (was 0.730), d=0.742, R2=-0.031
- Significant at all subsample sizes (50%-100%), temporal stable (p=0.88)
- Cover letter retargeted CLSC->AI & Law + P4 companion disclosure
- Metadata/titlepage/supplementary updated

Co-Authored-By: Claude <noreply@anthropic.com>
</commit_message>
<xml_diff>
--- a/reports/paper2_cover_letter.docx
+++ b/reports/paper2_cover_letter.docx
@@ -2,13 +2,13 @@
 <file path=word/document.xml><?xml version="1.0" encoding="utf-8"?>
 <w:document xmlns:w="http://schemas.openxmlformats.org/wordprocessingml/2006/main" xmlns:m="http://schemas.openxmlformats.org/officeDocument/2006/math" xmlns:r="http://schemas.openxmlformats.org/officeDocument/2006/relationships" xmlns:o="urn:schemas-microsoft-com:office:office" xmlns:v="urn:schemas-microsoft-com:vml" xmlns:w10="urn:schemas-microsoft-com:office:word" xmlns:a="http://schemas.openxmlformats.org/drawingml/2006/main" xmlns:pic="http://schemas.openxmlformats.org/drawingml/2006/picture" xmlns:wp="http://schemas.openxmlformats.org/drawingml/2006/wordprocessingDrawing">
   <w:body>
-    <w:bookmarkStart w:id="9" w:name="cover-letter-crime-law-and-social-change"/>
+    <w:bookmarkStart w:id="9" w:name="X1b7d4cb4bfe67895b37a2e8a721343285362369"/>
     <w:p>
       <w:pPr>
         <w:pStyle w:val="Heading1"/>
       </w:pPr>
       <w:r>
-        <w:t xml:space="preserve">Cover Letter — Crime, Law and Social Change</w:t>
+        <w:t xml:space="preserve">Cover Letter — Artificial Intelligence and Law (Springer)</w:t>
       </w:r>
     </w:p>
     <w:p>
@@ -50,7 +50,7 @@
           <w:i/>
           <w:iCs/>
         </w:rPr>
-        <w:t xml:space="preserve">Crime, Law and Social Change</w:t>
+        <w:t xml:space="preserve">Artificial Intelligence and Law</w:t>
       </w:r>
       <w:r>
         <w:t xml:space="preserve">.</w:t>
@@ -61,7 +61,7 @@
         <w:pStyle w:val="BodyText"/>
       </w:pPr>
       <w:r>
-        <w:t xml:space="preserve">This study presents the first large-scale computational analysis of Indonesian corruption sentencing, using a novel corpus of 671 Supreme Court verdicts. We report three principal findings:</w:t>
+        <w:t xml:space="preserve">This study presents the first large-scale computational analysis of Indonesian corruption sentencing, using a corpus of 693 Supreme Court verdicts (374 analysis-ready). We report three principal findings:</w:t>
       </w:r>
     </w:p>
     <w:p>
@@ -82,7 +82,7 @@
         <w:t xml:space="preserve"> </w:t>
       </w:r>
       <w:r>
-        <w:t xml:space="preserve">After controlling for prosecution demand, cases classified under Pasal 2 (enrichment) of Indonesia’s Anti-Corruption Law receive sentences 0.73 years longer than equivalent Pasal 3 (authority abuse) cases (b=0.730, p=0.002, Cohen’s d=0.58). This association is temporally stable (pre-2024 and post-2024, interaction p=0.94) and is detected through text analysis of judicial reasoning rather than structured case metadata.</w:t>
+        <w:t xml:space="preserve">After controlling for prosecution demand, cases classified under Pasal 2 (enrichment) of Indonesia’s Anti-Corruption Law receive sentences 0.82 years longer than equivalent Pasal 3 (authority abuse) cases (b=0.818, p&lt;0.001, Cohen’s d=0.74). This association is temporally stable (pre-2024 and post-2024, interaction p=0.88) and is detected through text analysis of judicial reasoning rather than structured case metadata — demonstrating that unstructured reasoning text carries sentencing-relevant information that formal case classifications miss.</w:t>
       </w:r>
     </w:p>
     <w:p>
@@ -103,7 +103,7 @@
         <w:t xml:space="preserve"> </w:t>
       </w:r>
       <w:r>
-        <w:t xml:space="preserve">The ratio of sentence to prosecution demand (mean 0.78) cannot be predicted from any available feature (R2=-0.01), suggesting that approximately 40% of sentencing variance reflects factors not recoverable from published verdicts.</w:t>
+        <w:t xml:space="preserve">The ratio of sentence to prosecution demand (mean 0.80) cannot be predicted from any available feature (cross-validated R2=-0.03), suggesting that approximately 40% of sentencing variance reflects factors not recoverable from published verdicts.</w:t>
       </w:r>
     </w:p>
     <w:p>
@@ -124,7 +124,7 @@
         <w:t xml:space="preserve"> </w:t>
       </w:r>
       <w:r>
-        <w:t xml:space="preserve">to improve sentencing prediction at this corpus size, a negative result documented across 30+ experiments with TF-IDF, transformer embeddings, and domain-specific features.</w:t>
+        <w:t xml:space="preserve">to improve sentencing prediction at this corpus size, a negative result documented across 30+ experiments with TF-IDF, transformer embeddings, and domain-specific features. This calibrates expectations for computational legal analysis in data-scarce settings.</w:t>
       </w:r>
     </w:p>
     <w:p>
@@ -142,13 +142,44 @@
           <w:i/>
           <w:iCs/>
         </w:rPr>
-        <w:t xml:space="preserve">Crime, Law and Social Change</w:t>
+        <w:t xml:space="preserve">Artificial Intelligence and Law</w:t>
+      </w:r>
+      <w:r>
+        <w:t xml:space="preserve">: it applies rigorous computational methods to a novel Southeast Asian legal dataset, addresses the interpretability limits of NLP on small legal corpora, and has direct policy implications for judicial transparency and sentencing consistency monitoring.</w:t>
+      </w:r>
+    </w:p>
+    <w:p>
+      <w:pPr>
+        <w:pStyle w:val="BodyText"/>
+      </w:pPr>
+      <w:r>
+        <w:rPr>
+          <w:b/>
+          <w:bCs/>
+        </w:rPr>
+        <w:t xml:space="preserve">Related work disclosure:</w:t>
       </w:r>
       <w:r>
         <w:t xml:space="preserve"> </w:t>
       </w:r>
       <w:r>
-        <w:t xml:space="preserve">for several reasons: it addresses corruption sentencing — a core topic of the journal — using rigorous quantitative methods applied to a novel Southeast Asian dataset. The findings have direct policy implications for anti-corruption reform, judicial transparency, and sentencing consistency monitoring in Indonesia.</w:t>
+        <w:t xml:space="preserve">The author has a companion manuscript,</w:t>
+      </w:r>
+      <w:r>
+        <w:t xml:space="preserve"> </w:t>
+      </w:r>
+      <w:r>
+        <w:rPr>
+          <w:i/>
+          <w:iCs/>
+        </w:rPr>
+        <w:t xml:space="preserve">“Broken Proportionality: Prosecutorial Demands and State Financial Loss in Indonesian Corruption Cases”</w:t>
+      </w:r>
+      <w:r>
+        <w:t xml:space="preserve"> </w:t>
+      </w:r>
+      <w:r>
+        <w:t xml:space="preserve">(currently under review at Asian Journal of Criminology), which analyzes prosecutorial demand elasticity using the same corpus. The present manuscript is methodologically and substantively distinct: it examines charge-type effects and the predictability of the sentencing discount (judicial opacity), rather than prosecutorial demand proportionality. Both papers are cross-disclosed.</w:t>
       </w:r>
     </w:p>
     <w:p>

</xml_diff>